<commit_message>
Updated the version commit hash in the user documentation.
</commit_message>
<xml_diff>
--- a/submission/CrispRate-Task3-C.docx
+++ b/submission/CrispRate-Task3-C.docx
@@ -6660,1641 +6660,7 @@
         <w:t xml:space="preserve">The version of the code included in the submission matches up with the following commit hash: </w:t>
       </w:r>
       <w:r>
-        <w:t>f100ac4e3a211b760e597b1aef6c7882115a0147</w:t>
-      </w:r>
-    </w:p>
-    <w:p/>
-    <w:p/>
-    <w:p>
-      <w:pPr>
-        <w:pStyle w:val="Heading1"/>
-      </w:pPr>
-      <w:r>
-        <w:lastRenderedPageBreak/>
-        <w:t>Git Log</w:t>
-      </w:r>
-    </w:p>
-    <w:p>
-      <w:pPr>
-        <w:pStyle w:val="NormalWeb"/>
-        <w:pBdr>
-          <w:top w:val="single" w:sz="6" w:space="2" w:color="888888"/>
-          <w:left w:val="single" w:sz="6" w:space="2" w:color="888888"/>
-          <w:bottom w:val="single" w:sz="6" w:space="2" w:color="888888"/>
-          <w:right w:val="single" w:sz="6" w:space="2" w:color="888888"/>
-        </w:pBdr>
-        <w:shd w:val="clear" w:color="auto" w:fill="FEFEFE"/>
-        <w:tabs>
-          <w:tab w:val="left" w:pos="916"/>
-          <w:tab w:val="left" w:pos="1832"/>
-          <w:tab w:val="left" w:pos="2748"/>
-          <w:tab w:val="left" w:pos="3664"/>
-          <w:tab w:val="left" w:pos="4580"/>
-          <w:tab w:val="left" w:pos="5496"/>
-          <w:tab w:val="left" w:pos="6412"/>
-          <w:tab w:val="left" w:pos="7328"/>
-          <w:tab w:val="left" w:pos="8244"/>
-          <w:tab w:val="left" w:pos="9160"/>
-          <w:tab w:val="left" w:pos="10076"/>
-          <w:tab w:val="left" w:pos="10992"/>
-          <w:tab w:val="left" w:pos="11908"/>
-          <w:tab w:val="left" w:pos="12824"/>
-          <w:tab w:val="left" w:pos="13740"/>
-          <w:tab w:val="left" w:pos="14656"/>
-        </w:tabs>
-        <w:spacing w:before="0" w:beforeAutospacing="0" w:after="0" w:afterAutospacing="0"/>
-        <w:divId w:val="486169052"/>
-        <w:rPr>
-          <w:rFonts w:ascii="Consolas" w:hAnsi="Consolas" w:cs="Consolas"/>
-          <w:color w:val="404040" w:themeColor="text1" w:themeTint="BF"/>
-          <w:sz w:val="17"/>
-          <w:szCs w:val="17"/>
-        </w:rPr>
-      </w:pPr>
-      <w:r>
-        <w:rPr>
-          <w:rFonts w:ascii="Consolas" w:hAnsi="Consolas" w:cs="Consolas"/>
-          <w:color w:val="008000"/>
-          <w:sz w:val="17"/>
-          <w:szCs w:val="17"/>
-        </w:rPr>
-        <w:t xml:space="preserve">f100ac4 </w:t>
-      </w:r>
-      <w:r>
-        <w:rPr>
-          <w:rFonts w:ascii="Consolas" w:hAnsi="Consolas" w:cs="Consolas"/>
-          <w:color w:val="404040" w:themeColor="text1" w:themeTint="BF"/>
-          <w:sz w:val="17"/>
-          <w:szCs w:val="17"/>
-        </w:rPr>
-        <w:t xml:space="preserve">Added a missing test for </w:t>
-      </w:r>
-      <w:proofErr w:type="spellStart"/>
-      <w:r>
-        <w:rPr>
-          <w:rFonts w:ascii="Consolas" w:hAnsi="Consolas" w:cs="Consolas"/>
-          <w:color w:val="404040" w:themeColor="text1" w:themeTint="BF"/>
-          <w:sz w:val="17"/>
-          <w:szCs w:val="17"/>
-        </w:rPr>
-        <w:t>RatingService</w:t>
-      </w:r>
-      <w:proofErr w:type="spellEnd"/>
-      <w:r>
-        <w:rPr>
-          <w:rFonts w:ascii="Consolas" w:hAnsi="Consolas" w:cs="Consolas"/>
-          <w:color w:val="404040" w:themeColor="text1" w:themeTint="BF"/>
-          <w:sz w:val="17"/>
-          <w:szCs w:val="17"/>
-        </w:rPr>
-        <w:t>.</w:t>
-      </w:r>
-    </w:p>
-    <w:p>
-      <w:pPr>
-        <w:pStyle w:val="NormalWeb"/>
-        <w:pBdr>
-          <w:top w:val="single" w:sz="6" w:space="2" w:color="888888"/>
-          <w:left w:val="single" w:sz="6" w:space="2" w:color="888888"/>
-          <w:bottom w:val="single" w:sz="6" w:space="2" w:color="888888"/>
-          <w:right w:val="single" w:sz="6" w:space="2" w:color="888888"/>
-        </w:pBdr>
-        <w:shd w:val="clear" w:color="auto" w:fill="FEFEFE"/>
-        <w:tabs>
-          <w:tab w:val="left" w:pos="916"/>
-          <w:tab w:val="left" w:pos="1832"/>
-          <w:tab w:val="left" w:pos="2748"/>
-          <w:tab w:val="left" w:pos="3664"/>
-          <w:tab w:val="left" w:pos="4580"/>
-          <w:tab w:val="left" w:pos="5496"/>
-          <w:tab w:val="left" w:pos="6412"/>
-          <w:tab w:val="left" w:pos="7328"/>
-          <w:tab w:val="left" w:pos="8244"/>
-          <w:tab w:val="left" w:pos="9160"/>
-          <w:tab w:val="left" w:pos="10076"/>
-          <w:tab w:val="left" w:pos="10992"/>
-          <w:tab w:val="left" w:pos="11908"/>
-          <w:tab w:val="left" w:pos="12824"/>
-          <w:tab w:val="left" w:pos="13740"/>
-          <w:tab w:val="left" w:pos="14656"/>
-        </w:tabs>
-        <w:spacing w:before="0" w:beforeAutospacing="0" w:after="0" w:afterAutospacing="0"/>
-        <w:divId w:val="486169052"/>
-        <w:rPr>
-          <w:rFonts w:ascii="Consolas" w:hAnsi="Consolas" w:cs="Consolas"/>
-          <w:color w:val="404040" w:themeColor="text1" w:themeTint="BF"/>
-          <w:sz w:val="17"/>
-          <w:szCs w:val="17"/>
-        </w:rPr>
-      </w:pPr>
-      <w:r>
-        <w:rPr>
-          <w:rFonts w:ascii="Consolas" w:hAnsi="Consolas" w:cs="Consolas"/>
-          <w:color w:val="008000"/>
-          <w:sz w:val="17"/>
-          <w:szCs w:val="17"/>
-        </w:rPr>
-        <w:t xml:space="preserve">469fdd7 </w:t>
-      </w:r>
-      <w:r>
-        <w:rPr>
-          <w:rFonts w:ascii="Consolas" w:hAnsi="Consolas" w:cs="Consolas"/>
-          <w:color w:val="404040" w:themeColor="text1" w:themeTint="BF"/>
-          <w:sz w:val="17"/>
-          <w:szCs w:val="17"/>
-        </w:rPr>
-        <w:t>Added a button that adds demo establishments and ratings.</w:t>
-      </w:r>
-    </w:p>
-    <w:p>
-      <w:pPr>
-        <w:pStyle w:val="NormalWeb"/>
-        <w:pBdr>
-          <w:top w:val="single" w:sz="6" w:space="2" w:color="888888"/>
-          <w:left w:val="single" w:sz="6" w:space="2" w:color="888888"/>
-          <w:bottom w:val="single" w:sz="6" w:space="2" w:color="888888"/>
-          <w:right w:val="single" w:sz="6" w:space="2" w:color="888888"/>
-        </w:pBdr>
-        <w:shd w:val="clear" w:color="auto" w:fill="FEFEFE"/>
-        <w:tabs>
-          <w:tab w:val="left" w:pos="916"/>
-          <w:tab w:val="left" w:pos="1832"/>
-          <w:tab w:val="left" w:pos="2748"/>
-          <w:tab w:val="left" w:pos="3664"/>
-          <w:tab w:val="left" w:pos="4580"/>
-          <w:tab w:val="left" w:pos="5496"/>
-          <w:tab w:val="left" w:pos="6412"/>
-          <w:tab w:val="left" w:pos="7328"/>
-          <w:tab w:val="left" w:pos="8244"/>
-          <w:tab w:val="left" w:pos="9160"/>
-          <w:tab w:val="left" w:pos="10076"/>
-          <w:tab w:val="left" w:pos="10992"/>
-          <w:tab w:val="left" w:pos="11908"/>
-          <w:tab w:val="left" w:pos="12824"/>
-          <w:tab w:val="left" w:pos="13740"/>
-          <w:tab w:val="left" w:pos="14656"/>
-        </w:tabs>
-        <w:spacing w:before="0" w:beforeAutospacing="0" w:after="0" w:afterAutospacing="0"/>
-        <w:divId w:val="486169052"/>
-        <w:rPr>
-          <w:rFonts w:ascii="Consolas" w:hAnsi="Consolas" w:cs="Consolas"/>
-          <w:color w:val="404040" w:themeColor="text1" w:themeTint="BF"/>
-          <w:sz w:val="17"/>
-          <w:szCs w:val="17"/>
-        </w:rPr>
-      </w:pPr>
-      <w:r>
-        <w:rPr>
-          <w:rFonts w:ascii="Consolas" w:hAnsi="Consolas" w:cs="Consolas"/>
-          <w:color w:val="008000"/>
-          <w:sz w:val="17"/>
-          <w:szCs w:val="17"/>
-        </w:rPr>
-        <w:t xml:space="preserve">9b4cfb2 </w:t>
-      </w:r>
-      <w:r>
-        <w:rPr>
-          <w:rFonts w:ascii="Consolas" w:hAnsi="Consolas" w:cs="Consolas"/>
-          <w:color w:val="404040" w:themeColor="text1" w:themeTint="BF"/>
-          <w:sz w:val="17"/>
-          <w:szCs w:val="17"/>
-        </w:rPr>
-        <w:t xml:space="preserve">Fixed a </w:t>
-      </w:r>
-      <w:proofErr w:type="spellStart"/>
-      <w:r>
-        <w:rPr>
-          <w:rFonts w:ascii="Consolas" w:hAnsi="Consolas" w:cs="Consolas"/>
-          <w:color w:val="404040" w:themeColor="text1" w:themeTint="BF"/>
-          <w:sz w:val="17"/>
-          <w:szCs w:val="17"/>
-        </w:rPr>
-        <w:t>db</w:t>
-      </w:r>
-      <w:proofErr w:type="spellEnd"/>
-      <w:r>
-        <w:rPr>
-          <w:rFonts w:ascii="Consolas" w:hAnsi="Consolas" w:cs="Consolas"/>
-          <w:color w:val="404040" w:themeColor="text1" w:themeTint="BF"/>
-          <w:sz w:val="17"/>
-          <w:szCs w:val="17"/>
-        </w:rPr>
-        <w:t xml:space="preserve"> </w:t>
-      </w:r>
-      <w:proofErr w:type="spellStart"/>
-      <w:r>
-        <w:rPr>
-          <w:rFonts w:ascii="Consolas" w:hAnsi="Consolas" w:cs="Consolas"/>
-          <w:color w:val="404040" w:themeColor="text1" w:themeTint="BF"/>
-          <w:sz w:val="17"/>
-          <w:szCs w:val="17"/>
-        </w:rPr>
-        <w:t>url</w:t>
-      </w:r>
-      <w:proofErr w:type="spellEnd"/>
-      <w:r>
-        <w:rPr>
-          <w:rFonts w:ascii="Consolas" w:hAnsi="Consolas" w:cs="Consolas"/>
-          <w:color w:val="404040" w:themeColor="text1" w:themeTint="BF"/>
-          <w:sz w:val="17"/>
-          <w:szCs w:val="17"/>
-        </w:rPr>
-        <w:t xml:space="preserve"> in the properties file.</w:t>
-      </w:r>
-    </w:p>
-    <w:p>
-      <w:pPr>
-        <w:pStyle w:val="NormalWeb"/>
-        <w:pBdr>
-          <w:top w:val="single" w:sz="6" w:space="2" w:color="888888"/>
-          <w:left w:val="single" w:sz="6" w:space="2" w:color="888888"/>
-          <w:bottom w:val="single" w:sz="6" w:space="2" w:color="888888"/>
-          <w:right w:val="single" w:sz="6" w:space="2" w:color="888888"/>
-        </w:pBdr>
-        <w:shd w:val="clear" w:color="auto" w:fill="FEFEFE"/>
-        <w:tabs>
-          <w:tab w:val="left" w:pos="916"/>
-          <w:tab w:val="left" w:pos="1832"/>
-          <w:tab w:val="left" w:pos="2748"/>
-          <w:tab w:val="left" w:pos="3664"/>
-          <w:tab w:val="left" w:pos="4580"/>
-          <w:tab w:val="left" w:pos="5496"/>
-          <w:tab w:val="left" w:pos="6412"/>
-          <w:tab w:val="left" w:pos="7328"/>
-          <w:tab w:val="left" w:pos="8244"/>
-          <w:tab w:val="left" w:pos="9160"/>
-          <w:tab w:val="left" w:pos="10076"/>
-          <w:tab w:val="left" w:pos="10992"/>
-          <w:tab w:val="left" w:pos="11908"/>
-          <w:tab w:val="left" w:pos="12824"/>
-          <w:tab w:val="left" w:pos="13740"/>
-          <w:tab w:val="left" w:pos="14656"/>
-        </w:tabs>
-        <w:spacing w:before="0" w:beforeAutospacing="0" w:after="0" w:afterAutospacing="0"/>
-        <w:divId w:val="486169052"/>
-        <w:rPr>
-          <w:rFonts w:ascii="Consolas" w:hAnsi="Consolas" w:cs="Consolas"/>
-          <w:color w:val="404040" w:themeColor="text1" w:themeTint="BF"/>
-          <w:sz w:val="17"/>
-          <w:szCs w:val="17"/>
-        </w:rPr>
-      </w:pPr>
-      <w:r>
-        <w:rPr>
-          <w:rFonts w:ascii="Consolas" w:hAnsi="Consolas" w:cs="Consolas"/>
-          <w:color w:val="008000"/>
-          <w:sz w:val="17"/>
-          <w:szCs w:val="17"/>
-        </w:rPr>
-        <w:t xml:space="preserve">35524e6 </w:t>
-      </w:r>
-      <w:r>
-        <w:rPr>
-          <w:rFonts w:ascii="Consolas" w:hAnsi="Consolas" w:cs="Consolas"/>
-          <w:color w:val="404040" w:themeColor="text1" w:themeTint="BF"/>
-          <w:sz w:val="17"/>
-          <w:szCs w:val="17"/>
-        </w:rPr>
-        <w:t xml:space="preserve">Fixed a java version mismatch in the </w:t>
-      </w:r>
-      <w:proofErr w:type="spellStart"/>
-      <w:r>
-        <w:rPr>
-          <w:rFonts w:ascii="Consolas" w:hAnsi="Consolas" w:cs="Consolas"/>
-          <w:color w:val="404040" w:themeColor="text1" w:themeTint="BF"/>
-          <w:sz w:val="17"/>
-          <w:szCs w:val="17"/>
-        </w:rPr>
-        <w:t>dockerfile</w:t>
-      </w:r>
-      <w:proofErr w:type="spellEnd"/>
-      <w:r>
-        <w:rPr>
-          <w:rFonts w:ascii="Consolas" w:hAnsi="Consolas" w:cs="Consolas"/>
-          <w:color w:val="404040" w:themeColor="text1" w:themeTint="BF"/>
-          <w:sz w:val="17"/>
-          <w:szCs w:val="17"/>
-        </w:rPr>
-        <w:t>.</w:t>
-      </w:r>
-    </w:p>
-    <w:p>
-      <w:pPr>
-        <w:pStyle w:val="NormalWeb"/>
-        <w:pBdr>
-          <w:top w:val="single" w:sz="6" w:space="2" w:color="888888"/>
-          <w:left w:val="single" w:sz="6" w:space="2" w:color="888888"/>
-          <w:bottom w:val="single" w:sz="6" w:space="2" w:color="888888"/>
-          <w:right w:val="single" w:sz="6" w:space="2" w:color="888888"/>
-        </w:pBdr>
-        <w:shd w:val="clear" w:color="auto" w:fill="FEFEFE"/>
-        <w:tabs>
-          <w:tab w:val="left" w:pos="916"/>
-          <w:tab w:val="left" w:pos="1832"/>
-          <w:tab w:val="left" w:pos="2748"/>
-          <w:tab w:val="left" w:pos="3664"/>
-          <w:tab w:val="left" w:pos="4580"/>
-          <w:tab w:val="left" w:pos="5496"/>
-          <w:tab w:val="left" w:pos="6412"/>
-          <w:tab w:val="left" w:pos="7328"/>
-          <w:tab w:val="left" w:pos="8244"/>
-          <w:tab w:val="left" w:pos="9160"/>
-          <w:tab w:val="left" w:pos="10076"/>
-          <w:tab w:val="left" w:pos="10992"/>
-          <w:tab w:val="left" w:pos="11908"/>
-          <w:tab w:val="left" w:pos="12824"/>
-          <w:tab w:val="left" w:pos="13740"/>
-          <w:tab w:val="left" w:pos="14656"/>
-        </w:tabs>
-        <w:spacing w:before="0" w:beforeAutospacing="0" w:after="0" w:afterAutospacing="0"/>
-        <w:divId w:val="486169052"/>
-        <w:rPr>
-          <w:rFonts w:ascii="Consolas" w:hAnsi="Consolas" w:cs="Consolas"/>
-          <w:color w:val="404040" w:themeColor="text1" w:themeTint="BF"/>
-          <w:sz w:val="17"/>
-          <w:szCs w:val="17"/>
-        </w:rPr>
-      </w:pPr>
-      <w:r>
-        <w:rPr>
-          <w:rFonts w:ascii="Consolas" w:hAnsi="Consolas" w:cs="Consolas"/>
-          <w:color w:val="008000"/>
-          <w:sz w:val="17"/>
-          <w:szCs w:val="17"/>
-        </w:rPr>
-        <w:t xml:space="preserve">9ac98fd </w:t>
-      </w:r>
-      <w:r>
-        <w:rPr>
-          <w:rFonts w:ascii="Consolas" w:hAnsi="Consolas" w:cs="Consolas"/>
-          <w:color w:val="404040" w:themeColor="text1" w:themeTint="BF"/>
-          <w:sz w:val="17"/>
-          <w:szCs w:val="17"/>
-        </w:rPr>
-        <w:t xml:space="preserve">Created </w:t>
-      </w:r>
-      <w:proofErr w:type="spellStart"/>
-      <w:r>
-        <w:rPr>
-          <w:rFonts w:ascii="Consolas" w:hAnsi="Consolas" w:cs="Consolas"/>
-          <w:color w:val="404040" w:themeColor="text1" w:themeTint="BF"/>
-          <w:sz w:val="17"/>
-          <w:szCs w:val="17"/>
-        </w:rPr>
-        <w:t>Dockerfile</w:t>
-      </w:r>
-      <w:proofErr w:type="spellEnd"/>
-    </w:p>
-    <w:p>
-      <w:pPr>
-        <w:pStyle w:val="NormalWeb"/>
-        <w:pBdr>
-          <w:top w:val="single" w:sz="6" w:space="2" w:color="888888"/>
-          <w:left w:val="single" w:sz="6" w:space="2" w:color="888888"/>
-          <w:bottom w:val="single" w:sz="6" w:space="2" w:color="888888"/>
-          <w:right w:val="single" w:sz="6" w:space="2" w:color="888888"/>
-        </w:pBdr>
-        <w:shd w:val="clear" w:color="auto" w:fill="FEFEFE"/>
-        <w:tabs>
-          <w:tab w:val="left" w:pos="916"/>
-          <w:tab w:val="left" w:pos="1832"/>
-          <w:tab w:val="left" w:pos="2748"/>
-          <w:tab w:val="left" w:pos="3664"/>
-          <w:tab w:val="left" w:pos="4580"/>
-          <w:tab w:val="left" w:pos="5496"/>
-          <w:tab w:val="left" w:pos="6412"/>
-          <w:tab w:val="left" w:pos="7328"/>
-          <w:tab w:val="left" w:pos="8244"/>
-          <w:tab w:val="left" w:pos="9160"/>
-          <w:tab w:val="left" w:pos="10076"/>
-          <w:tab w:val="left" w:pos="10992"/>
-          <w:tab w:val="left" w:pos="11908"/>
-          <w:tab w:val="left" w:pos="12824"/>
-          <w:tab w:val="left" w:pos="13740"/>
-          <w:tab w:val="left" w:pos="14656"/>
-        </w:tabs>
-        <w:spacing w:before="0" w:beforeAutospacing="0" w:after="0" w:afterAutospacing="0"/>
-        <w:divId w:val="486169052"/>
-        <w:rPr>
-          <w:rFonts w:ascii="Consolas" w:hAnsi="Consolas" w:cs="Consolas"/>
-          <w:color w:val="404040" w:themeColor="text1" w:themeTint="BF"/>
-          <w:sz w:val="17"/>
-          <w:szCs w:val="17"/>
-        </w:rPr>
-      </w:pPr>
-      <w:r>
-        <w:rPr>
-          <w:rFonts w:ascii="Consolas" w:hAnsi="Consolas" w:cs="Consolas"/>
-          <w:color w:val="008000"/>
-          <w:sz w:val="17"/>
-          <w:szCs w:val="17"/>
-        </w:rPr>
-        <w:t xml:space="preserve">2c6d1db </w:t>
-      </w:r>
-      <w:r>
-        <w:rPr>
-          <w:rFonts w:ascii="Consolas" w:hAnsi="Consolas" w:cs="Consolas"/>
-          <w:color w:val="404040" w:themeColor="text1" w:themeTint="BF"/>
-          <w:sz w:val="17"/>
-          <w:szCs w:val="17"/>
-        </w:rPr>
-        <w:t xml:space="preserve">Updated </w:t>
-      </w:r>
-      <w:proofErr w:type="spellStart"/>
-      <w:proofErr w:type="gramStart"/>
-      <w:r>
-        <w:rPr>
-          <w:rFonts w:ascii="Consolas" w:hAnsi="Consolas" w:cs="Consolas"/>
-          <w:color w:val="404040" w:themeColor="text1" w:themeTint="BF"/>
-          <w:sz w:val="17"/>
-          <w:szCs w:val="17"/>
-        </w:rPr>
-        <w:t>application.properties</w:t>
-      </w:r>
-      <w:proofErr w:type="spellEnd"/>
-      <w:proofErr w:type="gramEnd"/>
-      <w:r>
-        <w:rPr>
-          <w:rFonts w:ascii="Consolas" w:hAnsi="Consolas" w:cs="Consolas"/>
-          <w:color w:val="404040" w:themeColor="text1" w:themeTint="BF"/>
-          <w:sz w:val="17"/>
-          <w:szCs w:val="17"/>
-        </w:rPr>
-        <w:t xml:space="preserve"> to prepare for Render deployment.</w:t>
-      </w:r>
-    </w:p>
-    <w:p>
-      <w:pPr>
-        <w:pStyle w:val="NormalWeb"/>
-        <w:pBdr>
-          <w:top w:val="single" w:sz="6" w:space="2" w:color="888888"/>
-          <w:left w:val="single" w:sz="6" w:space="2" w:color="888888"/>
-          <w:bottom w:val="single" w:sz="6" w:space="2" w:color="888888"/>
-          <w:right w:val="single" w:sz="6" w:space="2" w:color="888888"/>
-        </w:pBdr>
-        <w:shd w:val="clear" w:color="auto" w:fill="FEFEFE"/>
-        <w:tabs>
-          <w:tab w:val="left" w:pos="916"/>
-          <w:tab w:val="left" w:pos="1832"/>
-          <w:tab w:val="left" w:pos="2748"/>
-          <w:tab w:val="left" w:pos="3664"/>
-          <w:tab w:val="left" w:pos="4580"/>
-          <w:tab w:val="left" w:pos="5496"/>
-          <w:tab w:val="left" w:pos="6412"/>
-          <w:tab w:val="left" w:pos="7328"/>
-          <w:tab w:val="left" w:pos="8244"/>
-          <w:tab w:val="left" w:pos="9160"/>
-          <w:tab w:val="left" w:pos="10076"/>
-          <w:tab w:val="left" w:pos="10992"/>
-          <w:tab w:val="left" w:pos="11908"/>
-          <w:tab w:val="left" w:pos="12824"/>
-          <w:tab w:val="left" w:pos="13740"/>
-          <w:tab w:val="left" w:pos="14656"/>
-        </w:tabs>
-        <w:spacing w:before="0" w:beforeAutospacing="0" w:after="0" w:afterAutospacing="0"/>
-        <w:divId w:val="486169052"/>
-        <w:rPr>
-          <w:rFonts w:ascii="Consolas" w:hAnsi="Consolas" w:cs="Consolas"/>
-          <w:color w:val="404040" w:themeColor="text1" w:themeTint="BF"/>
-          <w:sz w:val="17"/>
-          <w:szCs w:val="17"/>
-        </w:rPr>
-      </w:pPr>
-      <w:r>
-        <w:rPr>
-          <w:rFonts w:ascii="Consolas" w:hAnsi="Consolas" w:cs="Consolas"/>
-          <w:color w:val="008000"/>
-          <w:sz w:val="17"/>
-          <w:szCs w:val="17"/>
-        </w:rPr>
-        <w:t xml:space="preserve">3e5763b </w:t>
-      </w:r>
-      <w:r>
-        <w:rPr>
-          <w:rFonts w:ascii="Consolas" w:hAnsi="Consolas" w:cs="Consolas"/>
-          <w:color w:val="404040" w:themeColor="text1" w:themeTint="BF"/>
-          <w:sz w:val="17"/>
-          <w:szCs w:val="17"/>
-        </w:rPr>
-        <w:t>B. 'Design and develop a full stack product' has been completed</w:t>
-      </w:r>
-    </w:p>
-    <w:p>
-      <w:pPr>
-        <w:pStyle w:val="NormalWeb"/>
-        <w:pBdr>
-          <w:top w:val="single" w:sz="6" w:space="2" w:color="888888"/>
-          <w:left w:val="single" w:sz="6" w:space="2" w:color="888888"/>
-          <w:bottom w:val="single" w:sz="6" w:space="2" w:color="888888"/>
-          <w:right w:val="single" w:sz="6" w:space="2" w:color="888888"/>
-        </w:pBdr>
-        <w:shd w:val="clear" w:color="auto" w:fill="FEFEFE"/>
-        <w:tabs>
-          <w:tab w:val="left" w:pos="916"/>
-          <w:tab w:val="left" w:pos="1832"/>
-          <w:tab w:val="left" w:pos="2748"/>
-          <w:tab w:val="left" w:pos="3664"/>
-          <w:tab w:val="left" w:pos="4580"/>
-          <w:tab w:val="left" w:pos="5496"/>
-          <w:tab w:val="left" w:pos="6412"/>
-          <w:tab w:val="left" w:pos="7328"/>
-          <w:tab w:val="left" w:pos="8244"/>
-          <w:tab w:val="left" w:pos="9160"/>
-          <w:tab w:val="left" w:pos="10076"/>
-          <w:tab w:val="left" w:pos="10992"/>
-          <w:tab w:val="left" w:pos="11908"/>
-          <w:tab w:val="left" w:pos="12824"/>
-          <w:tab w:val="left" w:pos="13740"/>
-          <w:tab w:val="left" w:pos="14656"/>
-        </w:tabs>
-        <w:spacing w:before="0" w:beforeAutospacing="0" w:after="0" w:afterAutospacing="0"/>
-        <w:divId w:val="486169052"/>
-        <w:rPr>
-          <w:rFonts w:ascii="Consolas" w:hAnsi="Consolas" w:cs="Consolas"/>
-          <w:color w:val="404040" w:themeColor="text1" w:themeTint="BF"/>
-          <w:sz w:val="17"/>
-          <w:szCs w:val="17"/>
-        </w:rPr>
-      </w:pPr>
-      <w:r>
-        <w:rPr>
-          <w:rFonts w:ascii="Consolas" w:hAnsi="Consolas" w:cs="Consolas"/>
-          <w:color w:val="008000"/>
-          <w:sz w:val="17"/>
-          <w:szCs w:val="17"/>
-        </w:rPr>
-        <w:t xml:space="preserve">2b8255a </w:t>
-      </w:r>
-      <w:r>
-        <w:rPr>
-          <w:rFonts w:ascii="Consolas" w:hAnsi="Consolas" w:cs="Consolas"/>
-          <w:color w:val="404040" w:themeColor="text1" w:themeTint="BF"/>
-          <w:sz w:val="17"/>
-          <w:szCs w:val="17"/>
-        </w:rPr>
-        <w:t>Added a feature that allows for admins to edit establishment details.</w:t>
-      </w:r>
-    </w:p>
-    <w:p>
-      <w:pPr>
-        <w:pStyle w:val="NormalWeb"/>
-        <w:pBdr>
-          <w:top w:val="single" w:sz="6" w:space="2" w:color="888888"/>
-          <w:left w:val="single" w:sz="6" w:space="2" w:color="888888"/>
-          <w:bottom w:val="single" w:sz="6" w:space="2" w:color="888888"/>
-          <w:right w:val="single" w:sz="6" w:space="2" w:color="888888"/>
-        </w:pBdr>
-        <w:shd w:val="clear" w:color="auto" w:fill="FEFEFE"/>
-        <w:tabs>
-          <w:tab w:val="left" w:pos="916"/>
-          <w:tab w:val="left" w:pos="1832"/>
-          <w:tab w:val="left" w:pos="2748"/>
-          <w:tab w:val="left" w:pos="3664"/>
-          <w:tab w:val="left" w:pos="4580"/>
-          <w:tab w:val="left" w:pos="5496"/>
-          <w:tab w:val="left" w:pos="6412"/>
-          <w:tab w:val="left" w:pos="7328"/>
-          <w:tab w:val="left" w:pos="8244"/>
-          <w:tab w:val="left" w:pos="9160"/>
-          <w:tab w:val="left" w:pos="10076"/>
-          <w:tab w:val="left" w:pos="10992"/>
-          <w:tab w:val="left" w:pos="11908"/>
-          <w:tab w:val="left" w:pos="12824"/>
-          <w:tab w:val="left" w:pos="13740"/>
-          <w:tab w:val="left" w:pos="14656"/>
-        </w:tabs>
-        <w:spacing w:before="0" w:beforeAutospacing="0" w:after="0" w:afterAutospacing="0"/>
-        <w:divId w:val="486169052"/>
-        <w:rPr>
-          <w:rFonts w:ascii="Consolas" w:hAnsi="Consolas" w:cs="Consolas"/>
-          <w:color w:val="404040" w:themeColor="text1" w:themeTint="BF"/>
-          <w:sz w:val="17"/>
-          <w:szCs w:val="17"/>
-        </w:rPr>
-      </w:pPr>
-      <w:r>
-        <w:rPr>
-          <w:rFonts w:ascii="Consolas" w:hAnsi="Consolas" w:cs="Consolas"/>
-          <w:color w:val="008000"/>
-          <w:sz w:val="17"/>
-          <w:szCs w:val="17"/>
-        </w:rPr>
-        <w:t xml:space="preserve">adbd2af </w:t>
-      </w:r>
-      <w:r>
-        <w:rPr>
-          <w:rFonts w:ascii="Consolas" w:hAnsi="Consolas" w:cs="Consolas"/>
-          <w:color w:val="404040" w:themeColor="text1" w:themeTint="BF"/>
-          <w:sz w:val="17"/>
-          <w:szCs w:val="17"/>
-        </w:rPr>
-        <w:t>Added a report feature that can export a csv of rating information.</w:t>
-      </w:r>
-    </w:p>
-    <w:p>
-      <w:pPr>
-        <w:pStyle w:val="NormalWeb"/>
-        <w:pBdr>
-          <w:top w:val="single" w:sz="6" w:space="2" w:color="888888"/>
-          <w:left w:val="single" w:sz="6" w:space="2" w:color="888888"/>
-          <w:bottom w:val="single" w:sz="6" w:space="2" w:color="888888"/>
-          <w:right w:val="single" w:sz="6" w:space="2" w:color="888888"/>
-        </w:pBdr>
-        <w:shd w:val="clear" w:color="auto" w:fill="FEFEFE"/>
-        <w:tabs>
-          <w:tab w:val="left" w:pos="916"/>
-          <w:tab w:val="left" w:pos="1832"/>
-          <w:tab w:val="left" w:pos="2748"/>
-          <w:tab w:val="left" w:pos="3664"/>
-          <w:tab w:val="left" w:pos="4580"/>
-          <w:tab w:val="left" w:pos="5496"/>
-          <w:tab w:val="left" w:pos="6412"/>
-          <w:tab w:val="left" w:pos="7328"/>
-          <w:tab w:val="left" w:pos="8244"/>
-          <w:tab w:val="left" w:pos="9160"/>
-          <w:tab w:val="left" w:pos="10076"/>
-          <w:tab w:val="left" w:pos="10992"/>
-          <w:tab w:val="left" w:pos="11908"/>
-          <w:tab w:val="left" w:pos="12824"/>
-          <w:tab w:val="left" w:pos="13740"/>
-          <w:tab w:val="left" w:pos="14656"/>
-        </w:tabs>
-        <w:spacing w:before="0" w:beforeAutospacing="0" w:after="0" w:afterAutospacing="0"/>
-        <w:divId w:val="486169052"/>
-        <w:rPr>
-          <w:rFonts w:ascii="Consolas" w:hAnsi="Consolas" w:cs="Consolas"/>
-          <w:color w:val="404040" w:themeColor="text1" w:themeTint="BF"/>
-          <w:sz w:val="17"/>
-          <w:szCs w:val="17"/>
-        </w:rPr>
-      </w:pPr>
-      <w:r>
-        <w:rPr>
-          <w:rFonts w:ascii="Consolas" w:hAnsi="Consolas" w:cs="Consolas"/>
-          <w:color w:val="008000"/>
-          <w:sz w:val="17"/>
-          <w:szCs w:val="17"/>
-        </w:rPr>
-        <w:t xml:space="preserve">dfa324a </w:t>
-      </w:r>
-      <w:r>
-        <w:rPr>
-          <w:rFonts w:ascii="Consolas" w:hAnsi="Consolas" w:cs="Consolas"/>
-          <w:color w:val="404040" w:themeColor="text1" w:themeTint="BF"/>
-          <w:sz w:val="17"/>
-          <w:szCs w:val="17"/>
-        </w:rPr>
-        <w:t>Added an admin dashboard with the ability to delete establishments and ratings.</w:t>
-      </w:r>
-    </w:p>
-    <w:p>
-      <w:pPr>
-        <w:pStyle w:val="NormalWeb"/>
-        <w:pBdr>
-          <w:top w:val="single" w:sz="6" w:space="2" w:color="888888"/>
-          <w:left w:val="single" w:sz="6" w:space="2" w:color="888888"/>
-          <w:bottom w:val="single" w:sz="6" w:space="2" w:color="888888"/>
-          <w:right w:val="single" w:sz="6" w:space="2" w:color="888888"/>
-        </w:pBdr>
-        <w:shd w:val="clear" w:color="auto" w:fill="FEFEFE"/>
-        <w:tabs>
-          <w:tab w:val="left" w:pos="916"/>
-          <w:tab w:val="left" w:pos="1832"/>
-          <w:tab w:val="left" w:pos="2748"/>
-          <w:tab w:val="left" w:pos="3664"/>
-          <w:tab w:val="left" w:pos="4580"/>
-          <w:tab w:val="left" w:pos="5496"/>
-          <w:tab w:val="left" w:pos="6412"/>
-          <w:tab w:val="left" w:pos="7328"/>
-          <w:tab w:val="left" w:pos="8244"/>
-          <w:tab w:val="left" w:pos="9160"/>
-          <w:tab w:val="left" w:pos="10076"/>
-          <w:tab w:val="left" w:pos="10992"/>
-          <w:tab w:val="left" w:pos="11908"/>
-          <w:tab w:val="left" w:pos="12824"/>
-          <w:tab w:val="left" w:pos="13740"/>
-          <w:tab w:val="left" w:pos="14656"/>
-        </w:tabs>
-        <w:spacing w:before="0" w:beforeAutospacing="0" w:after="0" w:afterAutospacing="0"/>
-        <w:divId w:val="486169052"/>
-        <w:rPr>
-          <w:rFonts w:ascii="Consolas" w:hAnsi="Consolas" w:cs="Consolas"/>
-          <w:color w:val="404040" w:themeColor="text1" w:themeTint="BF"/>
-          <w:sz w:val="17"/>
-          <w:szCs w:val="17"/>
-        </w:rPr>
-      </w:pPr>
-      <w:r>
-        <w:rPr>
-          <w:rFonts w:ascii="Consolas" w:hAnsi="Consolas" w:cs="Consolas"/>
-          <w:color w:val="008000"/>
-          <w:sz w:val="17"/>
-          <w:szCs w:val="17"/>
-        </w:rPr>
-        <w:t xml:space="preserve">fd0e4ae </w:t>
-      </w:r>
-      <w:r>
-        <w:rPr>
-          <w:rFonts w:ascii="Consolas" w:hAnsi="Consolas" w:cs="Consolas"/>
-          <w:color w:val="404040" w:themeColor="text1" w:themeTint="BF"/>
-          <w:sz w:val="17"/>
-          <w:szCs w:val="17"/>
-        </w:rPr>
-        <w:t>Adding an edit form and the ability for an authorized user to edit a rating.</w:t>
-      </w:r>
-    </w:p>
-    <w:p>
-      <w:pPr>
-        <w:pStyle w:val="NormalWeb"/>
-        <w:pBdr>
-          <w:top w:val="single" w:sz="6" w:space="2" w:color="888888"/>
-          <w:left w:val="single" w:sz="6" w:space="2" w:color="888888"/>
-          <w:bottom w:val="single" w:sz="6" w:space="2" w:color="888888"/>
-          <w:right w:val="single" w:sz="6" w:space="2" w:color="888888"/>
-        </w:pBdr>
-        <w:shd w:val="clear" w:color="auto" w:fill="FEFEFE"/>
-        <w:tabs>
-          <w:tab w:val="left" w:pos="916"/>
-          <w:tab w:val="left" w:pos="1832"/>
-          <w:tab w:val="left" w:pos="2748"/>
-          <w:tab w:val="left" w:pos="3664"/>
-          <w:tab w:val="left" w:pos="4580"/>
-          <w:tab w:val="left" w:pos="5496"/>
-          <w:tab w:val="left" w:pos="6412"/>
-          <w:tab w:val="left" w:pos="7328"/>
-          <w:tab w:val="left" w:pos="8244"/>
-          <w:tab w:val="left" w:pos="9160"/>
-          <w:tab w:val="left" w:pos="10076"/>
-          <w:tab w:val="left" w:pos="10992"/>
-          <w:tab w:val="left" w:pos="11908"/>
-          <w:tab w:val="left" w:pos="12824"/>
-          <w:tab w:val="left" w:pos="13740"/>
-          <w:tab w:val="left" w:pos="14656"/>
-        </w:tabs>
-        <w:spacing w:before="0" w:beforeAutospacing="0" w:after="0" w:afterAutospacing="0"/>
-        <w:divId w:val="486169052"/>
-        <w:rPr>
-          <w:rFonts w:ascii="Consolas" w:hAnsi="Consolas" w:cs="Consolas"/>
-          <w:color w:val="404040" w:themeColor="text1" w:themeTint="BF"/>
-          <w:sz w:val="17"/>
-          <w:szCs w:val="17"/>
-        </w:rPr>
-      </w:pPr>
-      <w:proofErr w:type="gramStart"/>
-      <w:r>
-        <w:rPr>
-          <w:rFonts w:ascii="Consolas" w:hAnsi="Consolas" w:cs="Consolas"/>
-          <w:color w:val="008000"/>
-          <w:sz w:val="17"/>
-          <w:szCs w:val="17"/>
-        </w:rPr>
-        <w:t>d3853ce</w:t>
-      </w:r>
-      <w:proofErr w:type="gramEnd"/>
-      <w:r>
-        <w:rPr>
-          <w:rFonts w:ascii="Consolas" w:hAnsi="Consolas" w:cs="Consolas"/>
-          <w:color w:val="008000"/>
-          <w:sz w:val="17"/>
-          <w:szCs w:val="17"/>
-        </w:rPr>
-        <w:t xml:space="preserve"> </w:t>
-      </w:r>
-      <w:r>
-        <w:rPr>
-          <w:rFonts w:ascii="Consolas" w:hAnsi="Consolas" w:cs="Consolas"/>
-          <w:color w:val="404040" w:themeColor="text1" w:themeTint="BF"/>
-          <w:sz w:val="17"/>
-          <w:szCs w:val="17"/>
-        </w:rPr>
-        <w:t>I added an establishment form to add new restaurants and fixed a bug that was preventing the form to get saved.</w:t>
-      </w:r>
-    </w:p>
-    <w:p>
-      <w:pPr>
-        <w:pStyle w:val="NormalWeb"/>
-        <w:pBdr>
-          <w:top w:val="single" w:sz="6" w:space="2" w:color="888888"/>
-          <w:left w:val="single" w:sz="6" w:space="2" w:color="888888"/>
-          <w:bottom w:val="single" w:sz="6" w:space="2" w:color="888888"/>
-          <w:right w:val="single" w:sz="6" w:space="2" w:color="888888"/>
-        </w:pBdr>
-        <w:shd w:val="clear" w:color="auto" w:fill="FEFEFE"/>
-        <w:tabs>
-          <w:tab w:val="left" w:pos="916"/>
-          <w:tab w:val="left" w:pos="1832"/>
-          <w:tab w:val="left" w:pos="2748"/>
-          <w:tab w:val="left" w:pos="3664"/>
-          <w:tab w:val="left" w:pos="4580"/>
-          <w:tab w:val="left" w:pos="5496"/>
-          <w:tab w:val="left" w:pos="6412"/>
-          <w:tab w:val="left" w:pos="7328"/>
-          <w:tab w:val="left" w:pos="8244"/>
-          <w:tab w:val="left" w:pos="9160"/>
-          <w:tab w:val="left" w:pos="10076"/>
-          <w:tab w:val="left" w:pos="10992"/>
-          <w:tab w:val="left" w:pos="11908"/>
-          <w:tab w:val="left" w:pos="12824"/>
-          <w:tab w:val="left" w:pos="13740"/>
-          <w:tab w:val="left" w:pos="14656"/>
-        </w:tabs>
-        <w:spacing w:before="0" w:beforeAutospacing="0" w:after="0" w:afterAutospacing="0"/>
-        <w:divId w:val="486169052"/>
-        <w:rPr>
-          <w:rFonts w:ascii="Consolas" w:hAnsi="Consolas" w:cs="Consolas"/>
-          <w:color w:val="404040" w:themeColor="text1" w:themeTint="BF"/>
-          <w:sz w:val="17"/>
-          <w:szCs w:val="17"/>
-        </w:rPr>
-      </w:pPr>
-      <w:r>
-        <w:rPr>
-          <w:rFonts w:ascii="Consolas" w:hAnsi="Consolas" w:cs="Consolas"/>
-          <w:color w:val="008000"/>
-          <w:sz w:val="17"/>
-          <w:szCs w:val="17"/>
-        </w:rPr>
-        <w:t xml:space="preserve">79cee55 </w:t>
-      </w:r>
-      <w:r>
-        <w:rPr>
-          <w:rFonts w:ascii="Consolas" w:hAnsi="Consolas" w:cs="Consolas"/>
-          <w:color w:val="404040" w:themeColor="text1" w:themeTint="BF"/>
-          <w:sz w:val="17"/>
-          <w:szCs w:val="17"/>
-        </w:rPr>
-        <w:t>Added establishment detail and home layouts.</w:t>
-      </w:r>
-    </w:p>
-    <w:p>
-      <w:pPr>
-        <w:pStyle w:val="NormalWeb"/>
-        <w:pBdr>
-          <w:top w:val="single" w:sz="6" w:space="2" w:color="888888"/>
-          <w:left w:val="single" w:sz="6" w:space="2" w:color="888888"/>
-          <w:bottom w:val="single" w:sz="6" w:space="2" w:color="888888"/>
-          <w:right w:val="single" w:sz="6" w:space="2" w:color="888888"/>
-        </w:pBdr>
-        <w:shd w:val="clear" w:color="auto" w:fill="FEFEFE"/>
-        <w:tabs>
-          <w:tab w:val="left" w:pos="916"/>
-          <w:tab w:val="left" w:pos="1832"/>
-          <w:tab w:val="left" w:pos="2748"/>
-          <w:tab w:val="left" w:pos="3664"/>
-          <w:tab w:val="left" w:pos="4580"/>
-          <w:tab w:val="left" w:pos="5496"/>
-          <w:tab w:val="left" w:pos="6412"/>
-          <w:tab w:val="left" w:pos="7328"/>
-          <w:tab w:val="left" w:pos="8244"/>
-          <w:tab w:val="left" w:pos="9160"/>
-          <w:tab w:val="left" w:pos="10076"/>
-          <w:tab w:val="left" w:pos="10992"/>
-          <w:tab w:val="left" w:pos="11908"/>
-          <w:tab w:val="left" w:pos="12824"/>
-          <w:tab w:val="left" w:pos="13740"/>
-          <w:tab w:val="left" w:pos="14656"/>
-        </w:tabs>
-        <w:spacing w:before="0" w:beforeAutospacing="0" w:after="0" w:afterAutospacing="0"/>
-        <w:divId w:val="486169052"/>
-        <w:rPr>
-          <w:rFonts w:ascii="Consolas" w:hAnsi="Consolas" w:cs="Consolas"/>
-          <w:color w:val="404040" w:themeColor="text1" w:themeTint="BF"/>
-          <w:sz w:val="17"/>
-          <w:szCs w:val="17"/>
-        </w:rPr>
-      </w:pPr>
-      <w:r>
-        <w:rPr>
-          <w:rFonts w:ascii="Consolas" w:hAnsi="Consolas" w:cs="Consolas"/>
-          <w:color w:val="008000"/>
-          <w:sz w:val="17"/>
-          <w:szCs w:val="17"/>
-        </w:rPr>
-        <w:t xml:space="preserve">0caae56 </w:t>
-      </w:r>
-      <w:r>
-        <w:rPr>
-          <w:rFonts w:ascii="Consolas" w:hAnsi="Consolas" w:cs="Consolas"/>
-          <w:color w:val="404040" w:themeColor="text1" w:themeTint="BF"/>
-          <w:sz w:val="17"/>
-          <w:szCs w:val="17"/>
-        </w:rPr>
-        <w:t xml:space="preserve">Created a login and registration page with bootstrap </w:t>
-      </w:r>
-      <w:proofErr w:type="spellStart"/>
-      <w:r>
-        <w:rPr>
-          <w:rFonts w:ascii="Consolas" w:hAnsi="Consolas" w:cs="Consolas"/>
-          <w:color w:val="404040" w:themeColor="text1" w:themeTint="BF"/>
-          <w:sz w:val="17"/>
-          <w:szCs w:val="17"/>
-        </w:rPr>
-        <w:t>css</w:t>
-      </w:r>
-      <w:proofErr w:type="spellEnd"/>
-      <w:r>
-        <w:rPr>
-          <w:rFonts w:ascii="Consolas" w:hAnsi="Consolas" w:cs="Consolas"/>
-          <w:color w:val="404040" w:themeColor="text1" w:themeTint="BF"/>
-          <w:sz w:val="17"/>
-          <w:szCs w:val="17"/>
-        </w:rPr>
-        <w:t xml:space="preserve"> to check if the login logic worked. and it DOES</w:t>
-      </w:r>
-    </w:p>
-    <w:p>
-      <w:pPr>
-        <w:pStyle w:val="NormalWeb"/>
-        <w:pBdr>
-          <w:top w:val="single" w:sz="6" w:space="2" w:color="888888"/>
-          <w:left w:val="single" w:sz="6" w:space="2" w:color="888888"/>
-          <w:bottom w:val="single" w:sz="6" w:space="2" w:color="888888"/>
-          <w:right w:val="single" w:sz="6" w:space="2" w:color="888888"/>
-        </w:pBdr>
-        <w:shd w:val="clear" w:color="auto" w:fill="FEFEFE"/>
-        <w:tabs>
-          <w:tab w:val="left" w:pos="916"/>
-          <w:tab w:val="left" w:pos="1832"/>
-          <w:tab w:val="left" w:pos="2748"/>
-          <w:tab w:val="left" w:pos="3664"/>
-          <w:tab w:val="left" w:pos="4580"/>
-          <w:tab w:val="left" w:pos="5496"/>
-          <w:tab w:val="left" w:pos="6412"/>
-          <w:tab w:val="left" w:pos="7328"/>
-          <w:tab w:val="left" w:pos="8244"/>
-          <w:tab w:val="left" w:pos="9160"/>
-          <w:tab w:val="left" w:pos="10076"/>
-          <w:tab w:val="left" w:pos="10992"/>
-          <w:tab w:val="left" w:pos="11908"/>
-          <w:tab w:val="left" w:pos="12824"/>
-          <w:tab w:val="left" w:pos="13740"/>
-          <w:tab w:val="left" w:pos="14656"/>
-        </w:tabs>
-        <w:spacing w:before="0" w:beforeAutospacing="0" w:after="0" w:afterAutospacing="0"/>
-        <w:divId w:val="486169052"/>
-        <w:rPr>
-          <w:rFonts w:ascii="Consolas" w:hAnsi="Consolas" w:cs="Consolas"/>
-          <w:color w:val="404040" w:themeColor="text1" w:themeTint="BF"/>
-          <w:sz w:val="17"/>
-          <w:szCs w:val="17"/>
-        </w:rPr>
-      </w:pPr>
-      <w:r>
-        <w:rPr>
-          <w:rFonts w:ascii="Consolas" w:hAnsi="Consolas" w:cs="Consolas"/>
-          <w:color w:val="008000"/>
-          <w:sz w:val="17"/>
-          <w:szCs w:val="17"/>
-        </w:rPr>
-        <w:t xml:space="preserve">04b0301 </w:t>
-      </w:r>
-      <w:r>
-        <w:rPr>
-          <w:rFonts w:ascii="Consolas" w:hAnsi="Consolas" w:cs="Consolas"/>
-          <w:color w:val="404040" w:themeColor="text1" w:themeTint="BF"/>
-          <w:sz w:val="17"/>
-          <w:szCs w:val="17"/>
-        </w:rPr>
-        <w:t>Created services, config, and controller packages with classes.</w:t>
-      </w:r>
-    </w:p>
-    <w:p>
-      <w:pPr>
-        <w:pStyle w:val="NormalWeb"/>
-        <w:pBdr>
-          <w:top w:val="single" w:sz="6" w:space="2" w:color="888888"/>
-          <w:left w:val="single" w:sz="6" w:space="2" w:color="888888"/>
-          <w:bottom w:val="single" w:sz="6" w:space="2" w:color="888888"/>
-          <w:right w:val="single" w:sz="6" w:space="2" w:color="888888"/>
-        </w:pBdr>
-        <w:shd w:val="clear" w:color="auto" w:fill="FEFEFE"/>
-        <w:tabs>
-          <w:tab w:val="left" w:pos="916"/>
-          <w:tab w:val="left" w:pos="1832"/>
-          <w:tab w:val="left" w:pos="2748"/>
-          <w:tab w:val="left" w:pos="3664"/>
-          <w:tab w:val="left" w:pos="4580"/>
-          <w:tab w:val="left" w:pos="5496"/>
-          <w:tab w:val="left" w:pos="6412"/>
-          <w:tab w:val="left" w:pos="7328"/>
-          <w:tab w:val="left" w:pos="8244"/>
-          <w:tab w:val="left" w:pos="9160"/>
-          <w:tab w:val="left" w:pos="10076"/>
-          <w:tab w:val="left" w:pos="10992"/>
-          <w:tab w:val="left" w:pos="11908"/>
-          <w:tab w:val="left" w:pos="12824"/>
-          <w:tab w:val="left" w:pos="13740"/>
-          <w:tab w:val="left" w:pos="14656"/>
-        </w:tabs>
-        <w:spacing w:before="0" w:beforeAutospacing="0" w:after="0" w:afterAutospacing="0"/>
-        <w:divId w:val="486169052"/>
-        <w:rPr>
-          <w:rFonts w:ascii="Consolas" w:hAnsi="Consolas" w:cs="Consolas"/>
-          <w:color w:val="404040" w:themeColor="text1" w:themeTint="BF"/>
-          <w:sz w:val="17"/>
-          <w:szCs w:val="17"/>
-        </w:rPr>
-      </w:pPr>
-      <w:r>
-        <w:rPr>
-          <w:rFonts w:ascii="Consolas" w:hAnsi="Consolas" w:cs="Consolas"/>
-          <w:color w:val="008000"/>
-          <w:sz w:val="17"/>
-          <w:szCs w:val="17"/>
-        </w:rPr>
-        <w:t xml:space="preserve">922ef11 </w:t>
-      </w:r>
-      <w:r>
-        <w:rPr>
-          <w:rFonts w:ascii="Consolas" w:hAnsi="Consolas" w:cs="Consolas"/>
-          <w:color w:val="404040" w:themeColor="text1" w:themeTint="BF"/>
-          <w:sz w:val="17"/>
-          <w:szCs w:val="17"/>
-        </w:rPr>
-        <w:t>Added a lot of the classes and repos.</w:t>
-      </w:r>
-    </w:p>
-    <w:p>
-      <w:pPr>
-        <w:pStyle w:val="NormalWeb"/>
-        <w:pBdr>
-          <w:top w:val="single" w:sz="6" w:space="2" w:color="888888"/>
-          <w:left w:val="single" w:sz="6" w:space="2" w:color="888888"/>
-          <w:bottom w:val="single" w:sz="6" w:space="2" w:color="888888"/>
-          <w:right w:val="single" w:sz="6" w:space="2" w:color="888888"/>
-        </w:pBdr>
-        <w:shd w:val="clear" w:color="auto" w:fill="FEFEFE"/>
-        <w:tabs>
-          <w:tab w:val="left" w:pos="916"/>
-          <w:tab w:val="left" w:pos="1832"/>
-          <w:tab w:val="left" w:pos="2748"/>
-          <w:tab w:val="left" w:pos="3664"/>
-          <w:tab w:val="left" w:pos="4580"/>
-          <w:tab w:val="left" w:pos="5496"/>
-          <w:tab w:val="left" w:pos="6412"/>
-          <w:tab w:val="left" w:pos="7328"/>
-          <w:tab w:val="left" w:pos="8244"/>
-          <w:tab w:val="left" w:pos="9160"/>
-          <w:tab w:val="left" w:pos="10076"/>
-          <w:tab w:val="left" w:pos="10992"/>
-          <w:tab w:val="left" w:pos="11908"/>
-          <w:tab w:val="left" w:pos="12824"/>
-          <w:tab w:val="left" w:pos="13740"/>
-          <w:tab w:val="left" w:pos="14656"/>
-        </w:tabs>
-        <w:spacing w:before="0" w:beforeAutospacing="0" w:after="0" w:afterAutospacing="0"/>
-        <w:divId w:val="486169052"/>
-        <w:rPr>
-          <w:rFonts w:ascii="Consolas" w:hAnsi="Consolas" w:cs="Consolas"/>
-          <w:color w:val="404040" w:themeColor="text1" w:themeTint="BF"/>
-          <w:sz w:val="17"/>
-          <w:szCs w:val="17"/>
-        </w:rPr>
-      </w:pPr>
-      <w:r>
-        <w:rPr>
-          <w:rFonts w:ascii="Consolas" w:hAnsi="Consolas" w:cs="Consolas"/>
-          <w:color w:val="008000"/>
-          <w:sz w:val="17"/>
-          <w:szCs w:val="17"/>
-        </w:rPr>
-        <w:t xml:space="preserve">3a7f85a </w:t>
-      </w:r>
-      <w:r>
-        <w:rPr>
-          <w:rFonts w:ascii="Consolas" w:hAnsi="Consolas" w:cs="Consolas"/>
-          <w:color w:val="404040" w:themeColor="text1" w:themeTint="BF"/>
-          <w:sz w:val="17"/>
-          <w:szCs w:val="17"/>
-        </w:rPr>
-        <w:t xml:space="preserve">Merge branch 'main' of </w:t>
-      </w:r>
-      <w:proofErr w:type="gramStart"/>
-      <w:r>
-        <w:rPr>
-          <w:rFonts w:ascii="Consolas" w:hAnsi="Consolas" w:cs="Consolas"/>
-          <w:color w:val="404040" w:themeColor="text1" w:themeTint="BF"/>
-          <w:sz w:val="17"/>
-          <w:szCs w:val="17"/>
-        </w:rPr>
-        <w:t>gitlab.com:wgu</w:t>
-      </w:r>
-      <w:proofErr w:type="gramEnd"/>
-      <w:r>
-        <w:rPr>
-          <w:rFonts w:ascii="Consolas" w:hAnsi="Consolas" w:cs="Consolas"/>
-          <w:color w:val="404040" w:themeColor="text1" w:themeTint="BF"/>
-          <w:sz w:val="17"/>
-          <w:szCs w:val="17"/>
-        </w:rPr>
-        <w:t>-gitlab-environment/student-repos/tylts/d424-software-engineering-capstone Pulling and merging from WGU GitLab repo that was generated</w:t>
-      </w:r>
-    </w:p>
-    <w:p>
-      <w:pPr>
-        <w:pStyle w:val="NormalWeb"/>
-        <w:pBdr>
-          <w:top w:val="single" w:sz="6" w:space="2" w:color="888888"/>
-          <w:left w:val="single" w:sz="6" w:space="2" w:color="888888"/>
-          <w:bottom w:val="single" w:sz="6" w:space="2" w:color="888888"/>
-          <w:right w:val="single" w:sz="6" w:space="2" w:color="888888"/>
-        </w:pBdr>
-        <w:shd w:val="clear" w:color="auto" w:fill="FEFEFE"/>
-        <w:tabs>
-          <w:tab w:val="left" w:pos="916"/>
-          <w:tab w:val="left" w:pos="1832"/>
-          <w:tab w:val="left" w:pos="2748"/>
-          <w:tab w:val="left" w:pos="3664"/>
-          <w:tab w:val="left" w:pos="4580"/>
-          <w:tab w:val="left" w:pos="5496"/>
-          <w:tab w:val="left" w:pos="6412"/>
-          <w:tab w:val="left" w:pos="7328"/>
-          <w:tab w:val="left" w:pos="8244"/>
-          <w:tab w:val="left" w:pos="9160"/>
-          <w:tab w:val="left" w:pos="10076"/>
-          <w:tab w:val="left" w:pos="10992"/>
-          <w:tab w:val="left" w:pos="11908"/>
-          <w:tab w:val="left" w:pos="12824"/>
-          <w:tab w:val="left" w:pos="13740"/>
-          <w:tab w:val="left" w:pos="14656"/>
-        </w:tabs>
-        <w:spacing w:before="0" w:beforeAutospacing="0" w:after="0" w:afterAutospacing="0"/>
-        <w:divId w:val="486169052"/>
-        <w:rPr>
-          <w:rFonts w:ascii="Consolas" w:hAnsi="Consolas" w:cs="Consolas"/>
-          <w:color w:val="404040" w:themeColor="text1" w:themeTint="BF"/>
-          <w:sz w:val="17"/>
-          <w:szCs w:val="17"/>
-        </w:rPr>
-      </w:pPr>
-      <w:r>
-        <w:rPr>
-          <w:rFonts w:ascii="Consolas" w:hAnsi="Consolas" w:cs="Consolas"/>
-          <w:color w:val="008000"/>
-          <w:sz w:val="17"/>
-          <w:szCs w:val="17"/>
-        </w:rPr>
-        <w:t xml:space="preserve">28991d1 </w:t>
-      </w:r>
-      <w:r>
-        <w:rPr>
-          <w:rFonts w:ascii="Consolas" w:hAnsi="Consolas" w:cs="Consolas"/>
-          <w:color w:val="404040" w:themeColor="text1" w:themeTint="BF"/>
-          <w:sz w:val="17"/>
-          <w:szCs w:val="17"/>
-        </w:rPr>
-        <w:t xml:space="preserve">Added </w:t>
-      </w:r>
-      <w:proofErr w:type="spellStart"/>
-      <w:r>
-        <w:rPr>
-          <w:rFonts w:ascii="Consolas" w:hAnsi="Consolas" w:cs="Consolas"/>
-          <w:color w:val="404040" w:themeColor="text1" w:themeTint="BF"/>
-          <w:sz w:val="17"/>
-          <w:szCs w:val="17"/>
-        </w:rPr>
-        <w:t>vcs</w:t>
-      </w:r>
-      <w:proofErr w:type="spellEnd"/>
-      <w:r>
-        <w:rPr>
-          <w:rFonts w:ascii="Consolas" w:hAnsi="Consolas" w:cs="Consolas"/>
-          <w:color w:val="404040" w:themeColor="text1" w:themeTint="BF"/>
-          <w:sz w:val="17"/>
-          <w:szCs w:val="17"/>
-        </w:rPr>
-        <w:t xml:space="preserve"> for some reason</w:t>
-      </w:r>
-    </w:p>
-    <w:p>
-      <w:pPr>
-        <w:pStyle w:val="NormalWeb"/>
-        <w:pBdr>
-          <w:top w:val="single" w:sz="6" w:space="2" w:color="888888"/>
-          <w:left w:val="single" w:sz="6" w:space="2" w:color="888888"/>
-          <w:bottom w:val="single" w:sz="6" w:space="2" w:color="888888"/>
-          <w:right w:val="single" w:sz="6" w:space="2" w:color="888888"/>
-        </w:pBdr>
-        <w:shd w:val="clear" w:color="auto" w:fill="FEFEFE"/>
-        <w:tabs>
-          <w:tab w:val="left" w:pos="916"/>
-          <w:tab w:val="left" w:pos="1832"/>
-          <w:tab w:val="left" w:pos="2748"/>
-          <w:tab w:val="left" w:pos="3664"/>
-          <w:tab w:val="left" w:pos="4580"/>
-          <w:tab w:val="left" w:pos="5496"/>
-          <w:tab w:val="left" w:pos="6412"/>
-          <w:tab w:val="left" w:pos="7328"/>
-          <w:tab w:val="left" w:pos="8244"/>
-          <w:tab w:val="left" w:pos="9160"/>
-          <w:tab w:val="left" w:pos="10076"/>
-          <w:tab w:val="left" w:pos="10992"/>
-          <w:tab w:val="left" w:pos="11908"/>
-          <w:tab w:val="left" w:pos="12824"/>
-          <w:tab w:val="left" w:pos="13740"/>
-          <w:tab w:val="left" w:pos="14656"/>
-        </w:tabs>
-        <w:spacing w:before="0" w:beforeAutospacing="0" w:after="0" w:afterAutospacing="0"/>
-        <w:divId w:val="486169052"/>
-        <w:rPr>
-          <w:rFonts w:ascii="Consolas" w:hAnsi="Consolas" w:cs="Consolas"/>
-          <w:color w:val="404040" w:themeColor="text1" w:themeTint="BF"/>
-          <w:sz w:val="17"/>
-          <w:szCs w:val="17"/>
-        </w:rPr>
-      </w:pPr>
-      <w:r>
-        <w:rPr>
-          <w:rFonts w:ascii="Consolas" w:hAnsi="Consolas" w:cs="Consolas"/>
-          <w:color w:val="008000"/>
-          <w:sz w:val="17"/>
-          <w:szCs w:val="17"/>
-        </w:rPr>
-        <w:t xml:space="preserve">8f88c9b </w:t>
-      </w:r>
-      <w:r>
-        <w:rPr>
-          <w:rFonts w:ascii="Consolas" w:hAnsi="Consolas" w:cs="Consolas"/>
-          <w:color w:val="404040" w:themeColor="text1" w:themeTint="BF"/>
-          <w:sz w:val="17"/>
-          <w:szCs w:val="17"/>
-        </w:rPr>
-        <w:t>Init commit with Spring Boot bones</w:t>
-      </w:r>
-    </w:p>
-    <w:p>
-      <w:pPr>
-        <w:pStyle w:val="NormalWeb"/>
-        <w:pBdr>
-          <w:top w:val="single" w:sz="6" w:space="2" w:color="888888"/>
-          <w:left w:val="single" w:sz="6" w:space="2" w:color="888888"/>
-          <w:bottom w:val="single" w:sz="6" w:space="2" w:color="888888"/>
-          <w:right w:val="single" w:sz="6" w:space="2" w:color="888888"/>
-        </w:pBdr>
-        <w:shd w:val="clear" w:color="auto" w:fill="FEFEFE"/>
-        <w:tabs>
-          <w:tab w:val="left" w:pos="916"/>
-          <w:tab w:val="left" w:pos="1832"/>
-          <w:tab w:val="left" w:pos="2748"/>
-          <w:tab w:val="left" w:pos="3664"/>
-          <w:tab w:val="left" w:pos="4580"/>
-          <w:tab w:val="left" w:pos="5496"/>
-          <w:tab w:val="left" w:pos="6412"/>
-          <w:tab w:val="left" w:pos="7328"/>
-          <w:tab w:val="left" w:pos="8244"/>
-          <w:tab w:val="left" w:pos="9160"/>
-          <w:tab w:val="left" w:pos="10076"/>
-          <w:tab w:val="left" w:pos="10992"/>
-          <w:tab w:val="left" w:pos="11908"/>
-          <w:tab w:val="left" w:pos="12824"/>
-          <w:tab w:val="left" w:pos="13740"/>
-          <w:tab w:val="left" w:pos="14656"/>
-        </w:tabs>
-        <w:spacing w:before="0" w:beforeAutospacing="0" w:after="0" w:afterAutospacing="0"/>
-        <w:divId w:val="486169052"/>
-        <w:rPr>
-          <w:rFonts w:ascii="Consolas" w:hAnsi="Consolas" w:cs="Consolas"/>
-          <w:color w:val="404040" w:themeColor="text1" w:themeTint="BF"/>
-          <w:sz w:val="17"/>
-          <w:szCs w:val="17"/>
-        </w:rPr>
-      </w:pPr>
-      <w:r>
-        <w:rPr>
-          <w:rFonts w:ascii="Consolas" w:hAnsi="Consolas" w:cs="Consolas"/>
-          <w:color w:val="008000"/>
-          <w:sz w:val="17"/>
-          <w:szCs w:val="17"/>
-        </w:rPr>
-        <w:t xml:space="preserve">9fc6ffc </w:t>
-      </w:r>
-      <w:r>
-        <w:rPr>
-          <w:rFonts w:ascii="Consolas" w:hAnsi="Consolas" w:cs="Consolas"/>
-          <w:color w:val="404040" w:themeColor="text1" w:themeTint="BF"/>
-          <w:sz w:val="17"/>
-          <w:szCs w:val="17"/>
-        </w:rPr>
-        <w:t xml:space="preserve">Corrected </w:t>
-      </w:r>
-      <w:proofErr w:type="spellStart"/>
-      <w:r>
-        <w:rPr>
-          <w:rFonts w:ascii="Consolas" w:hAnsi="Consolas" w:cs="Consolas"/>
-          <w:color w:val="404040" w:themeColor="text1" w:themeTint="BF"/>
-          <w:sz w:val="17"/>
-          <w:szCs w:val="17"/>
-        </w:rPr>
-        <w:t>mispelling</w:t>
-      </w:r>
-      <w:proofErr w:type="spellEnd"/>
-    </w:p>
-    <w:p>
-      <w:pPr>
-        <w:pStyle w:val="NormalWeb"/>
-        <w:pBdr>
-          <w:top w:val="single" w:sz="6" w:space="2" w:color="888888"/>
-          <w:left w:val="single" w:sz="6" w:space="2" w:color="888888"/>
-          <w:bottom w:val="single" w:sz="6" w:space="2" w:color="888888"/>
-          <w:right w:val="single" w:sz="6" w:space="2" w:color="888888"/>
-        </w:pBdr>
-        <w:shd w:val="clear" w:color="auto" w:fill="FEFEFE"/>
-        <w:tabs>
-          <w:tab w:val="left" w:pos="916"/>
-          <w:tab w:val="left" w:pos="1832"/>
-          <w:tab w:val="left" w:pos="2748"/>
-          <w:tab w:val="left" w:pos="3664"/>
-          <w:tab w:val="left" w:pos="4580"/>
-          <w:tab w:val="left" w:pos="5496"/>
-          <w:tab w:val="left" w:pos="6412"/>
-          <w:tab w:val="left" w:pos="7328"/>
-          <w:tab w:val="left" w:pos="8244"/>
-          <w:tab w:val="left" w:pos="9160"/>
-          <w:tab w:val="left" w:pos="10076"/>
-          <w:tab w:val="left" w:pos="10992"/>
-          <w:tab w:val="left" w:pos="11908"/>
-          <w:tab w:val="left" w:pos="12824"/>
-          <w:tab w:val="left" w:pos="13740"/>
-          <w:tab w:val="left" w:pos="14656"/>
-        </w:tabs>
-        <w:spacing w:before="0" w:beforeAutospacing="0" w:after="0" w:afterAutospacing="0"/>
-        <w:divId w:val="486169052"/>
-        <w:rPr>
-          <w:rFonts w:ascii="Consolas" w:hAnsi="Consolas" w:cs="Consolas"/>
-          <w:color w:val="404040" w:themeColor="text1" w:themeTint="BF"/>
-          <w:sz w:val="17"/>
-          <w:szCs w:val="17"/>
-        </w:rPr>
-      </w:pPr>
-      <w:r>
-        <w:rPr>
-          <w:rFonts w:ascii="Consolas" w:hAnsi="Consolas" w:cs="Consolas"/>
-          <w:color w:val="008000"/>
-          <w:sz w:val="17"/>
-          <w:szCs w:val="17"/>
-        </w:rPr>
-        <w:t xml:space="preserve">808c354 </w:t>
-      </w:r>
-      <w:r>
-        <w:rPr>
-          <w:rFonts w:ascii="Consolas" w:hAnsi="Consolas" w:cs="Consolas"/>
-          <w:color w:val="404040" w:themeColor="text1" w:themeTint="BF"/>
-          <w:sz w:val="17"/>
-          <w:szCs w:val="17"/>
-        </w:rPr>
-        <w:t>Added Branching instructions to README</w:t>
-      </w:r>
-    </w:p>
-    <w:p>
-      <w:pPr>
-        <w:pStyle w:val="NormalWeb"/>
-        <w:pBdr>
-          <w:top w:val="single" w:sz="6" w:space="2" w:color="888888"/>
-          <w:left w:val="single" w:sz="6" w:space="2" w:color="888888"/>
-          <w:bottom w:val="single" w:sz="6" w:space="2" w:color="888888"/>
-          <w:right w:val="single" w:sz="6" w:space="2" w:color="888888"/>
-        </w:pBdr>
-        <w:shd w:val="clear" w:color="auto" w:fill="FEFEFE"/>
-        <w:tabs>
-          <w:tab w:val="left" w:pos="916"/>
-          <w:tab w:val="left" w:pos="1832"/>
-          <w:tab w:val="left" w:pos="2748"/>
-          <w:tab w:val="left" w:pos="3664"/>
-          <w:tab w:val="left" w:pos="4580"/>
-          <w:tab w:val="left" w:pos="5496"/>
-          <w:tab w:val="left" w:pos="6412"/>
-          <w:tab w:val="left" w:pos="7328"/>
-          <w:tab w:val="left" w:pos="8244"/>
-          <w:tab w:val="left" w:pos="9160"/>
-          <w:tab w:val="left" w:pos="10076"/>
-          <w:tab w:val="left" w:pos="10992"/>
-          <w:tab w:val="left" w:pos="11908"/>
-          <w:tab w:val="left" w:pos="12824"/>
-          <w:tab w:val="left" w:pos="13740"/>
-          <w:tab w:val="left" w:pos="14656"/>
-        </w:tabs>
-        <w:spacing w:before="0" w:beforeAutospacing="0" w:after="0" w:afterAutospacing="0"/>
-        <w:divId w:val="486169052"/>
-        <w:rPr>
-          <w:rFonts w:ascii="Consolas" w:hAnsi="Consolas" w:cs="Consolas"/>
-          <w:color w:val="404040" w:themeColor="text1" w:themeTint="BF"/>
-          <w:sz w:val="17"/>
-          <w:szCs w:val="17"/>
-        </w:rPr>
-      </w:pPr>
-      <w:r>
-        <w:rPr>
-          <w:rFonts w:ascii="Consolas" w:hAnsi="Consolas" w:cs="Consolas"/>
-          <w:color w:val="008000"/>
-          <w:sz w:val="17"/>
-          <w:szCs w:val="17"/>
-        </w:rPr>
-        <w:t xml:space="preserve">5c6cab3 </w:t>
-      </w:r>
-      <w:r>
-        <w:rPr>
-          <w:rFonts w:ascii="Consolas" w:hAnsi="Consolas" w:cs="Consolas"/>
-          <w:color w:val="404040" w:themeColor="text1" w:themeTint="BF"/>
-          <w:sz w:val="17"/>
-          <w:szCs w:val="17"/>
-        </w:rPr>
-        <w:t>Added WGU Template README.md</w:t>
-      </w:r>
-    </w:p>
-    <w:p>
-      <w:pPr>
-        <w:pStyle w:val="NormalWeb"/>
-        <w:pBdr>
-          <w:top w:val="single" w:sz="6" w:space="2" w:color="888888"/>
-          <w:left w:val="single" w:sz="6" w:space="2" w:color="888888"/>
-          <w:bottom w:val="single" w:sz="6" w:space="2" w:color="888888"/>
-          <w:right w:val="single" w:sz="6" w:space="2" w:color="888888"/>
-        </w:pBdr>
-        <w:shd w:val="clear" w:color="auto" w:fill="FEFEFE"/>
-        <w:tabs>
-          <w:tab w:val="left" w:pos="916"/>
-          <w:tab w:val="left" w:pos="1832"/>
-          <w:tab w:val="left" w:pos="2748"/>
-          <w:tab w:val="left" w:pos="3664"/>
-          <w:tab w:val="left" w:pos="4580"/>
-          <w:tab w:val="left" w:pos="5496"/>
-          <w:tab w:val="left" w:pos="6412"/>
-          <w:tab w:val="left" w:pos="7328"/>
-          <w:tab w:val="left" w:pos="8244"/>
-          <w:tab w:val="left" w:pos="9160"/>
-          <w:tab w:val="left" w:pos="10076"/>
-          <w:tab w:val="left" w:pos="10992"/>
-          <w:tab w:val="left" w:pos="11908"/>
-          <w:tab w:val="left" w:pos="12824"/>
-          <w:tab w:val="left" w:pos="13740"/>
-          <w:tab w:val="left" w:pos="14656"/>
-        </w:tabs>
-        <w:spacing w:before="0" w:beforeAutospacing="0" w:after="0" w:afterAutospacing="0"/>
-        <w:divId w:val="486169052"/>
-        <w:rPr>
-          <w:rFonts w:ascii="Consolas" w:hAnsi="Consolas" w:cs="Consolas"/>
-          <w:color w:val="404040" w:themeColor="text1" w:themeTint="BF"/>
-          <w:sz w:val="17"/>
-          <w:szCs w:val="17"/>
-        </w:rPr>
-      </w:pPr>
-      <w:r>
-        <w:rPr>
-          <w:rFonts w:ascii="Consolas" w:hAnsi="Consolas" w:cs="Consolas"/>
-          <w:color w:val="008000"/>
-          <w:sz w:val="17"/>
-          <w:szCs w:val="17"/>
-        </w:rPr>
-        <w:t xml:space="preserve">835201f </w:t>
-      </w:r>
-      <w:r>
-        <w:rPr>
-          <w:rFonts w:ascii="Consolas" w:hAnsi="Consolas" w:cs="Consolas"/>
-          <w:color w:val="404040" w:themeColor="text1" w:themeTint="BF"/>
-          <w:sz w:val="17"/>
-          <w:szCs w:val="17"/>
-        </w:rPr>
-        <w:t>Initial commit</w:t>
-      </w:r>
-      <w:r>
-        <w:rPr>
-          <w:rFonts w:ascii="Consolas" w:hAnsi="Consolas" w:cs="Consolas"/>
-          <w:color w:val="404040" w:themeColor="text1" w:themeTint="BF"/>
-          <w:sz w:val="17"/>
-          <w:szCs w:val="17"/>
-        </w:rPr>
-        <w:t>+</w:t>
-      </w:r>
-    </w:p>
-    <w:p>
-      <w:pPr>
-        <w:rPr>
-          <w:rStyle w:val="Heading1Char"/>
-        </w:rPr>
-      </w:pPr>
-      <w:r>
-        <w:rPr>
-          <w:rStyle w:val="Heading1Char"/>
-        </w:rPr>
-        <w:lastRenderedPageBreak/>
-        <w:t>GitLab Commit Log</w:t>
-      </w:r>
-      <w:r>
-        <w:br/>
-      </w:r>
-      <w:r>
-        <w:rPr>
-          <w:rStyle w:val="Heading1Char"/>
-        </w:rPr>
-        <w:drawing>
-          <wp:inline distT="0" distB="0" distL="0" distR="0" wp14:anchorId="4174B832" wp14:editId="4E34E102">
-            <wp:extent cx="4349348" cy="7819053"/>
-            <wp:effectExtent l="0" t="0" r="0" b="4445"/>
-            <wp:docPr id="831900672" name="Picture 1"/>
-            <wp:cNvGraphicFramePr>
-              <a:graphicFrameLocks xmlns:a="http://schemas.openxmlformats.org/drawingml/2006/main" noChangeAspect="1"/>
-            </wp:cNvGraphicFramePr>
-            <a:graphic xmlns:a="http://schemas.openxmlformats.org/drawingml/2006/main">
-              <a:graphicData uri="http://schemas.openxmlformats.org/drawingml/2006/picture">
-                <pic:pic xmlns:pic="http://schemas.openxmlformats.org/drawingml/2006/picture">
-                  <pic:nvPicPr>
-                    <pic:cNvPr id="831900672" name=""/>
-                    <pic:cNvPicPr/>
-                  </pic:nvPicPr>
-                  <pic:blipFill>
-                    <a:blip r:embed="rId7"/>
-                    <a:stretch>
-                      <a:fillRect/>
-                    </a:stretch>
-                  </pic:blipFill>
-                  <pic:spPr>
-                    <a:xfrm>
-                      <a:off x="0" y="0"/>
-                      <a:ext cx="4361210" cy="7840377"/>
-                    </a:xfrm>
-                    <a:prstGeom prst="rect">
-                      <a:avLst/>
-                    </a:prstGeom>
-                  </pic:spPr>
-                </pic:pic>
-              </a:graphicData>
-            </a:graphic>
-          </wp:inline>
-        </w:drawing>
-      </w:r>
-    </w:p>
-    <w:p/>
-    <w:p>
-      <w:pPr>
-        <w:rPr>
-          <w:rStyle w:val="Heading1Char"/>
-        </w:rPr>
-      </w:pPr>
-      <w:r>
-        <w:rPr>
-          <w:rStyle w:val="Heading1Char"/>
-        </w:rPr>
-        <w:t>Repository Graph</w:t>
-      </w:r>
-    </w:p>
-    <w:p>
-      <w:pPr>
-        <w:rPr>
-          <w:rStyle w:val="Heading1Char"/>
-        </w:rPr>
-      </w:pPr>
-      <w:r>
-        <w:rPr>
-          <w:rStyle w:val="Heading1Char"/>
-        </w:rPr>
-        <w:drawing>
-          <wp:inline distT="0" distB="0" distL="0" distR="0" wp14:anchorId="7158973E" wp14:editId="0DA54DAD">
-            <wp:extent cx="5943600" cy="4655820"/>
-            <wp:effectExtent l="0" t="0" r="0" b="5080"/>
-            <wp:docPr id="929134987" name="Picture 1"/>
-            <wp:cNvGraphicFramePr>
-              <a:graphicFrameLocks xmlns:a="http://schemas.openxmlformats.org/drawingml/2006/main" noChangeAspect="1"/>
-            </wp:cNvGraphicFramePr>
-            <a:graphic xmlns:a="http://schemas.openxmlformats.org/drawingml/2006/main">
-              <a:graphicData uri="http://schemas.openxmlformats.org/drawingml/2006/picture">
-                <pic:pic xmlns:pic="http://schemas.openxmlformats.org/drawingml/2006/picture">
-                  <pic:nvPicPr>
-                    <pic:cNvPr id="929134987" name=""/>
-                    <pic:cNvPicPr/>
-                  </pic:nvPicPr>
-                  <pic:blipFill>
-                    <a:blip r:embed="rId8"/>
-                    <a:stretch>
-                      <a:fillRect/>
-                    </a:stretch>
-                  </pic:blipFill>
-                  <pic:spPr>
-                    <a:xfrm>
-                      <a:off x="0" y="0"/>
-                      <a:ext cx="5943600" cy="4655820"/>
-                    </a:xfrm>
-                    <a:prstGeom prst="rect">
-                      <a:avLst/>
-                    </a:prstGeom>
-                  </pic:spPr>
-                </pic:pic>
-              </a:graphicData>
-            </a:graphic>
-          </wp:inline>
-        </w:drawing>
-      </w:r>
-    </w:p>
-    <w:p>
-      <w:pPr>
-        <w:rPr>
-          <w:rStyle w:val="Heading1Char"/>
-        </w:rPr>
-      </w:pPr>
-      <w:r>
-        <w:rPr>
-          <w:rStyle w:val="Heading1Char"/>
-        </w:rPr>
-        <w:br w:type="page"/>
+        <w:t>abe156f32f5a0a8f564ccc621e31c3284f1fd618</w:t>
       </w:r>
     </w:p>
     <w:p>
@@ -8856,7 +7222,7 @@
         </w:rPr>
         <w:t xml:space="preserve">Once it starts up, the application will be available locally at </w:t>
       </w:r>
-      <w:hyperlink r:id="rId9" w:history="1">
+      <w:hyperlink r:id="rId7" w:history="1">
         <w:r>
           <w:rPr>
             <w:rStyle w:val="Hyperlink"/>

</xml_diff>